<commit_message>
Reconciliação de documentos cadastro-clientes
</commit_message>
<xml_diff>
--- a/mps-nivel-c/oficial/04_registros/PROFARMA_Cadastro-de-Clientes/ADAP-PROFARMA01-001_Registro-de-Adaptacao.docx
+++ b/mps-nivel-c/oficial/04_registros/PROFARMA_Cadastro-de-Clientes/ADAP-PROFARMA01-001_Registro-de-Adaptacao.docx
@@ -1195,7 +1195,7 @@
                 <w:i w:val="0"/>
                 <w:sz w:val="20"/>
               </w:rPr>
-              <w:t>A execução dos testes de homologação foi responsabilidade conjunta: Timeware (Lucas Batista / QA) + equipe D1000 (Julielle Santos / QA)</w:t>
+              <w:t>A execução dos testes de homologação foi responsabilidade conjunta: Timeware (Caroline Sousa / QA) + equipe D1000 (Julielle Santos / QA)</w:t>
             </w:r>
           </w:p>
         </w:tc>
@@ -1409,7 +1409,7 @@
                 <w:i w:val="0"/>
                 <w:sz w:val="20"/>
               </w:rPr>
-              <w:t>Revisões de código realizadas com um revisor (Tech Lead Tiago Nascimento ou Erick Coelho por alternância)</w:t>
+              <w:t>Revisões de código realizadas com um revisor (Tech Lead Cézar Hiraki Velázquez)</w:t>
             </w:r>
           </w:p>
         </w:tc>
@@ -1435,7 +1435,7 @@
                 <w:i w:val="0"/>
                 <w:sz w:val="20"/>
               </w:rPr>
-              <w:t>Equipe de 4 Dev Backend; manter dois revisores independentes aumentaria o lead time dos PRs sem ganho proporcional de qualidade; o tech lead D1000 (Armando Junior) participava de revisões de mudanças arquiteturais</w:t>
+              <w:t>Equipe de 3 Dev Backend; manter dois revisores independentes aumentaria o lead time dos PRs sem ganho proporcional de qualidade; o tech lead D1000 (Armando Junior) participava de revisões de mudanças arquiteturais</w:t>
             </w:r>
           </w:p>
         </w:tc>
@@ -1515,7 +1515,7 @@
                 <w:i w:val="0"/>
                 <w:sz w:val="20"/>
               </w:rPr>
-              <w:t>Tech Lead (Tiago Nascimento) acumulou papel de Arquiteto da Solução nas primeiras 4 sprints; Gerente de Projeto (Abraão Oliveira) acumulou papel de Account Manager e GCO</w:t>
+              <w:t>Tech Lead (Cézar Hiraki Velázquez) acumulou papel de Arquiteto da Solução nas primeiras 4 sprints; Gerente de Projeto (Abraão Oliveira) acumulou papel de Account Manager e GCO</w:t>
             </w:r>
           </w:p>
         </w:tc>

</xml_diff>

<commit_message>
PROFARMA: corrige autoria do histórico dos registros (nomes reais)
Alinha o autor do histórico de revisões dos 21 registros do PROFARMA a
nomes reais, conforme CLAUDE.md regra 4 e o padrão já aplicado em
FRUKI/AASPCNJ:
- Abraão Oliveira (GP) em todos os registros de projeto;
- Jonathan Barbosa (auditor independente) no GQA.

Remove os rótulos "Time de Melhoria Contínua" e "Sistema de Auditoria /
Reconciliação GitLab" das linhas de histórico. Preserva as referências de
conteúdo ao "Time de Melhoria Contínua" (MED/VV — destinatário de
métricas/lições, não autoria). 21 .docx regenerados a partir dos .md
(imagens de evidência preservadas). Relatório de auditoria de consistência
atualizado (4ª divergência corrigida).

Co-Authored-By: Claude Opus 4.8 (1M context) <noreply@anthropic.com>
</commit_message>
<xml_diff>
--- a/mps-nivel-c/oficial/04_registros/PROFARMA_Cadastro-de-Clientes/ADAP-PROFARMA01-001_Registro-de-Adaptacao.docx
+++ b/mps-nivel-c/oficial/04_registros/PROFARMA_Cadastro-de-Clientes/ADAP-PROFARMA01-001_Registro-de-Adaptacao.docx
@@ -2625,7 +2625,7 @@
                 <w:i w:val="0"/>
                 <w:sz w:val="20"/>
               </w:rPr>
-              <w:t>Time de Melhoria Contínua</w:t>
+              <w:t>Abraão Oliveira</w:t>
             </w:r>
           </w:p>
         </w:tc>
@@ -2731,7 +2731,7 @@
                 <w:i w:val="0"/>
                 <w:sz w:val="20"/>
               </w:rPr>
-              <w:t>Time de Melhoria Contínua</w:t>
+              <w:t>Abraão Oliveira</w:t>
             </w:r>
           </w:p>
         </w:tc>

</xml_diff>